<commit_message>
docs: demo guide shows the MSA 1 / MSA 2 split as visible part dividers
The docx builder was silently dropping top-level headings, so the PART banners never appeared. Parts now
start on a new page with a shaded divider band; the subtitle and check dates cover both milestones.

Co-Authored-By: Claude Opus 5 <noreply@anthropic.com>
</commit_message>
<xml_diff>
--- a/docs/reference/B3_Code_Demo_Guide.docx
+++ b/docs/reference/B3_Code_Demo_Guide.docx
@@ -31,7 +31,7 @@
           <w:color w:val="2E4B73"/>
           <w:sz w:val="24"/>
         </w:rPr>
-        <w:t>How to run, show and read our MSA 1 code</w:t>
+        <w:t>How to run, show and read our code — MSA 1 and MSA 2</w:t>
       </w:r>
     </w:p>
     <w:p>
@@ -47,7 +47,7 @@
           <w:color w:val="555555"/>
           <w:sz w:val="19"/>
         </w:rPr>
-        <w:t>Group B3 · UST Electronics Engineering · Checked 13 September 2026</w:t>
+        <w:t>Group B3 · UST Electronics Engineering · MSA 1 checked 13–14 September, MSA 2 checked 16 September 2026</w:t>
       </w:r>
     </w:p>
     <w:p>
@@ -120,6 +120,35 @@
           <w:sz w:val="17"/>
         </w:rPr>
         <w:t xml:space="preserve"> is MSA 2: the learning half — what a bus sees, how it is scored, how it learns, and what the four training runs found, run on 16 September 2026. Each part stands on its own; nothing in Part 2 changes anything in Part 1.</w:t>
+      </w:r>
+    </w:p>
+    <w:p>
+      <w:pPr>
+        <w:spacing w:before="200" w:after="80" w:line="300" w:lineRule="auto"/>
+        <w:shd w:val="clear" w:color="auto" w:fill="E8EEF6"/>
+        <w:pBdr>
+          <w:left w:val="single" w:color="1F3B63" w:sz="48" w:space="12"/>
+        </w:pBdr>
+      </w:pPr>
+      <w:r>
+        <w:rPr>
+          <w:rFonts w:ascii="Calibri Light" w:hAnsi="Calibri Light" w:cs="Calibri Light" w:eastAsia="Calibri Light"/>
+          <w:b/>
+          <w:i w:val="0"/>
+          <w:color w:val="1F3B63"/>
+          <w:sz w:val="36"/>
+        </w:rPr>
+        <w:t xml:space="preserve">PART 1   </w:t>
+      </w:r>
+      <w:r>
+        <w:rPr>
+          <w:rFonts w:ascii="Calibri Light" w:hAnsi="Calibri Light" w:cs="Calibri Light" w:eastAsia="Calibri Light"/>
+          <w:b w:val="0"/>
+          <w:i w:val="0"/>
+          <w:color w:val="2E4B73"/>
+          <w:sz w:val="28"/>
+        </w:rPr>
+        <w:t>MSA 1: the data, the corridor, the calibration</w:t>
       </w:r>
     </w:p>
     <w:p>
@@ -1369,7 +1398,28 @@
           <w:color w:val="1F2933"/>
           <w:sz w:val="21"/>
         </w:rPr>
-        <w:t>) are MSA 2 work. They were not rewritten yet.</w:t>
+        <w:t xml:space="preserve">, </w:t>
+      </w:r>
+      <w:r>
+        <w:rPr>
+          <w:rFonts w:ascii="Consolas" w:hAnsi="Consolas" w:cs="Consolas" w:eastAsia="Consolas"/>
+          <w:b w:val="0"/>
+          <w:i w:val="0"/>
+          <w:color w:val="24405F"/>
+          <w:sz w:val="18"/>
+          <w:shd w:val="clear" w:color="auto" w:fill="F3F5F8"/>
+        </w:rPr>
+        <w:t>envs/obs.py</w:t>
+      </w:r>
+      <w:r>
+        <w:rPr>
+          <w:rFonts w:ascii="Calibri" w:hAnsi="Calibri" w:cs="Calibri" w:eastAsia="Calibri"/>
+          <w:b w:val="0"/>
+          <w:i w:val="0"/>
+          <w:color w:val="1F2933"/>
+          <w:sz w:val="21"/>
+        </w:rPr>
+        <w:t>) are MSA 2 work; they were rewritten in the same style on 16 September, and Part 2 covers them.</w:t>
       </w:r>
     </w:p>
     <w:p>
@@ -13090,6 +13140,40 @@
       </w:pPr>
     </w:p>
     <w:p>
+      <w:r>
+        <w:br w:type="page"/>
+      </w:r>
+    </w:p>
+    <w:p>
+      <w:pPr>
+        <w:spacing w:before="200" w:after="80" w:line="300" w:lineRule="auto"/>
+        <w:shd w:val="clear" w:color="auto" w:fill="E8EEF6"/>
+        <w:pBdr>
+          <w:left w:val="single" w:color="1F3B63" w:sz="48" w:space="12"/>
+        </w:pBdr>
+      </w:pPr>
+      <w:r>
+        <w:rPr>
+          <w:rFonts w:ascii="Calibri Light" w:hAnsi="Calibri Light" w:cs="Calibri Light" w:eastAsia="Calibri Light"/>
+          <w:b/>
+          <w:i w:val="0"/>
+          <w:color w:val="1F3B63"/>
+          <w:sz w:val="36"/>
+        </w:rPr>
+        <w:t xml:space="preserve">PART 2   </w:t>
+      </w:r>
+      <w:r>
+        <w:rPr>
+          <w:rFonts w:ascii="Calibri Light" w:hAnsi="Calibri Light" w:cs="Calibri Light" w:eastAsia="Calibri Light"/>
+          <w:b w:val="0"/>
+          <w:i w:val="0"/>
+          <w:color w:val="2E4B73"/>
+          <w:sz w:val="28"/>
+        </w:rPr>
+        <w:t>MSA 2: the learning half</w:t>
+      </w:r>
+    </w:p>
+    <w:p>
       <w:pPr>
         <w:jc w:val="left"/>
         <w:spacing w:before="0" w:after="110" w:line="264" w:lineRule="auto"/>
@@ -15012,6 +15096,11 @@
       </w:r>
     </w:p>
     <w:p>
+      <w:r>
+        <w:br w:type="page"/>
+      </w:r>
+    </w:p>
+    <w:p>
       <w:pPr>
         <w:pStyle w:val="Heading1"/>
         <w:keepNext/>
@@ -15690,6 +15779,11 @@
           <w:sz w:val="21"/>
         </w:rPr>
         <w:t>Thirty runs per controller, and every controller faces the same thirty disturbance patterns, so the only difference is the decision-making. Our learned policy is at 0.340 against Even-Headway’s 0.342 — it matches the best hand-written rule on an ordinary day.</w:t>
+      </w:r>
+    </w:p>
+    <w:p>
+      <w:r>
+        <w:br w:type="page"/>
       </w:r>
     </w:p>
     <w:p>

</xml_diff>